<commit_message>
Actualizar tarifas de tren a valores estandar de PeruRail en soles
Semilla: Expedition 210, Vistadome 280, Cusco - Machu Picchu 360,
Urubamba 260, Hidroelectrica 110, Titicaca Train 1450 y Andean Explorer
1850. Informes sembrados recalculados (INF-0001 712.60, INF-0002 230.00,
subtotales de tren 420/105/210) y traza de auditoria 145.00 -> 210.00.
Pruebas unitarias y casos CN-07/CN-11/CN-18/CN-21/CB-18 del documento
alineados con los nuevos importes (144 pruebas en verde).

Co-Authored-By: Claude Opus 5 <noreply@anthropic.com>
Claude-Session: https://claude.ai/code/session_01UthhjmQUHuLMAF9YwENp9x
</commit_message>
<xml_diff>
--- a/docs/ProyectoFinalSOftware.docx
+++ b/docs/ProyectoFinalSOftware.docx
@@ -36891,7 +36891,7 @@
                 <w:sz w:val="17"/>
                 <w:szCs w:val="17"/>
               </w:rPr>
-              <w:t xml:space="preserve">SerIdEstacionOrigen=San Pedro (-13.5225, -71.9822); SerIdEstacionDestino=Machu Picchu (-13.1547, -72.5250); SerHorarioSalida=06:10; SerHorarioLlegada=06:30; SerTarifa=210.00</w:t>
+              <w:t xml:space="preserve">SerIdEstacionOrigen=San Pedro (-13.5225, -71.9822); SerIdEstacionDestino=Machu Picchu (-13.1547, -72.5250); SerHorarioSalida=06:10; SerHorarioLlegada=06:30; SerTarifa=360.00</w:t>
             </w:r>
           </w:p>
         </w:tc>
@@ -38416,7 +38416,7 @@
                 <w:sz w:val="17"/>
                 <w:szCs w:val="17"/>
               </w:rPr>
-              <w:t>Formato=PDF; Ruta=Conjunto Arqueológico de Ollantaytambo (ida y vuelta); Edades=[38, 36, 8]; tarifa de tren S/ 145.00; entrada S/ 70.00</w:t>
+              <w:t>Formato=PDF; Ruta=Conjunto Arqueológico de Ollantaytambo (ida y vuelta); Edades=[38, 36, 8]; tarifa de tren S/ 210.00; entrada S/ 70.00</w:t>
             </w:r>
           </w:p>
         </w:tc>
@@ -38437,7 +38437,7 @@
                 <w:sz w:val="17"/>
                 <w:szCs w:val="17"/>
               </w:rPr>
-              <w:t>El sistema genera el informe consolidado descargable con ruta, clima, tiempo estimado, dificultad y el desglose por edad, con un total estimado de S/ 550.10 (dos adultos a S/ 215.00 y un niño de 8 años a S/ 120.10).</w:t>
+              <w:t>El sistema genera el informe consolidado descargable con ruta, clima, tiempo estimado, dificultad y el desglose por edad, con un total estimado de S/ 712.60 (dos adultos a S/ 280.00 y un niño de 8 años a S/ 152.60).</w:t>
             </w:r>
           </w:p>
         </w:tc>
@@ -39042,7 +39042,7 @@
                 <w:sz w:val="17"/>
                 <w:szCs w:val="17"/>
               </w:rPr>
-              <w:t>Edad=15; tarifa de tren S/ 145.00; entrada a la zona S/ 70.00</w:t>
+              <w:t>Edad=15; tarifa de tren S/ 210.00; entrada a la zona S/ 70.00</w:t>
             </w:r>
           </w:p>
         </w:tc>
@@ -39063,7 +39063,7 @@
                 <w:sz w:val="17"/>
                 <w:szCs w:val="17"/>
               </w:rPr>
-              <w:t>El sistema cobra tarifa de adulto en el tren (S/ 145.00) y tarifa de menor en la zona (S/ 47.60), con un total de S/ 192.60, porque PeruRail corta la tarifa de niño a los 12 años y la zona la mantiene hasta los 17.</w:t>
+              <w:t>El sistema cobra tarifa de adulto en el tren (S/ 210.00) y tarifa de menor en la zona (S/ 47.60), con un total de S/ 257.60, porque PeruRail corta la tarifa de niño a los 12 años y la zona la mantiene hasta los 17.</w:t>
             </w:r>
           </w:p>
         </w:tc>
@@ -40552,7 +40552,7 @@
                 <w:sz w:val="17"/>
                 <w:szCs w:val="17"/>
               </w:rPr>
-              <w:t xml:space="preserve">Servicio de tren = Machu Picchu → San Pedro (salida 14:55, S/ 210.00)</w:t>
+              <w:t xml:space="preserve">Servicio de tren = Machu Picchu → San Pedro (salida 14:55, S/ 360.00)</w:t>
             </w:r>
           </w:p>
         </w:tc>
@@ -41242,7 +41242,7 @@
                 <w:sz w:val="17"/>
                 <w:szCs w:val="17"/>
               </w:rPr>
-              <w:t xml:space="preserve">4) Pulsar «usar la sugerida», poner tarifa 150 y guardar.</w:t>
+              <w:t xml:space="preserve">4) Pulsar «usar la sugerida», poner tarifa 210 y guardar.</w:t>
             </w:r>
           </w:p>
           <w:p>
@@ -41284,7 +41284,7 @@
                 <w:sz w:val="17"/>
                 <w:szCs w:val="17"/>
               </w:rPr>
-              <w:t xml:space="preserve">Origen=Ollantaytambo; Destino=Machu Picchu; Salida=12:00; luego Llegada=13:30 y Salida=13:00; Tarifa=150.00; luego San Pedro → Machu Picchu, 06:10–06:30</w:t>
+              <w:t xml:space="preserve">Origen=Ollantaytambo; Destino=Machu Picchu; Salida=12:00; luego Llegada=13:30 y Salida=13:00; Tarifa=210.00; luego San Pedro → Machu Picchu, 06:10–06:30</w:t>
             </w:r>
           </w:p>
         </w:tc>

</xml_diff>

<commit_message>
Revision final: RF alineados con el documento, trenes desde estacion inactiva y doc al dia
Los comentarios del codigo arrastraban la numeracion antigua de requisitos
(desplazada en uno a partir de RF-10); ahora citan los RF-xx de la seccion
4.3.1 del documento. Los servicios que salen de una estacion inactiva ya no
se ofrecen en el selector de trenes ni se aceptan por URL en el informe
(RF-02), con prueba de repositorio sobre H2. Documento: capa de negocio
sin el SchedulerService inexistente, componentes de caja blanca al dia
(CB-14 a CB-19), CN-21 referido a RF-13 y nota en SerIdEstacionOrigen.
145 pruebas en verde.

Co-Authored-By: Claude Opus 5 <noreply@anthropic.com>
Claude-Session: https://claude.ai/code/session_01UthhjmQUHuLMAF9YwENp9x
</commit_message>
<xml_diff>
--- a/docs/ProyectoFinalSOftware.docx
+++ b/docs/ProyectoFinalSOftware.docx
@@ -14040,7 +14040,7 @@
       <w:r>
         <w:t xml:space="preserve"> Servicios de dominio — PreferenciaService (buscador de zonas por filtros acumulativos), ZonaTuristicaService, AforoService (validación y control de cupos diarios por número de personas), RutaPeatonalService (motor de cálculo de la ruta peatonal de ida y vuelta), TarifaService (categoría tarifaria que corresponde a cada edad), </w:t>
         <w:lastRenderedPageBreak/>
-        <w:t>InformeService (generación del informe consolidado) y SchedulerService (orquestación de las tareas periódicas).</w:t>
+        <w:t>InformeService (generación del informe consolidado), UsuarioService (auto-registro de turistas) y los trabajos programados SincronizacionPeruRailJob y SincronizacionSenamhiJob (Spring @Scheduled, configurados en SchedulerConfig).</w:t>
       </w:r>
     </w:p>
     <w:p>
@@ -23090,7 +23090,7 @@
                 <w:sz w:val="17"/>
                 <w:szCs w:val="17"/>
               </w:rPr>
-              <w:t>FK → Estacion(EstIdEstacion). Estación de origen del servicio.</w:t>
+              <w:t>FK → Estacion(EstIdEstacion). Estación de origen del servicio. Si esa estación está inactiva, el servicio se conserva pero no se ofrece al turista ni se acepta en el informe (RF-02).</w:t>
             </w:r>
           </w:p>
         </w:tc>
@@ -34370,7 +34370,7 @@
         <w:t xml:space="preserve">Componentes Evaluados: </w:t>
       </w:r>
       <w:r>
-        <w:t xml:space="preserve"> RutaPeatonalService, SenamhiClient, PeruRailClient, AforoService, TarifaService, AuditoriaService, ServicioTrenService e InformeService. Las pruebas se concentran en los métodos encargados de calcular la ruta peatonal (calcularRutaPeatonalIdaVuelta), procesar el feed climático (procesarFeedSenamhi), validar la tarifa del tren (validarTarifaPeruRail), validar el aforo disponible de una zona turística para todo el grupo (validarAforoDisponible), resolver la categoría tarifaria que corresponde a cada edad (categoriaPorEdad) y registrar la auditoría de las operaciones administrativas (registrarAuditoria) eliminar servicios de tren registrando su trazabilidad en auditoría (eliminar) y consultar el historial de informes por usuario autenticado (obtenerInformesPorUsuario).</w:t>
+        <w:t xml:space="preserve"> RutaPeatonalService, SenamhiClient, PeruRailClient, AforoService, TarifaService, AuditoriaService, ServicioTrenService, InformeService y UsuarioService. Las pruebas se concentran en los métodos encargados de calcular la ruta peatonal (calcularRutaPeatonalIdaVuelta), procesar el feed climático (procesarFeedSenamhi), validar la tarifa del tren (validarTarifaPeruRail), validar el aforo disponible de una zona turística para todo el grupo (validarAforoDisponible), resolver la categoría tarifaria que corresponde a cada edad (categoriaPorEdad), registrar la auditoría de las operaciones administrativas (registrarAuditoria), eliminar servicios de tren registrando su trazabilidad en auditoría (eliminar), consultar el historial de informes por usuario autenticado (obtenerInformesPorUsuario), derivar y validar los horarios y la velocidad de un servicio de tren (completarTiempoTransito, guardar, validarVelocidadFisica), dar de alta una cuenta de turista (registrarTurista) y acotar el circuito caminable al tope del nivel de dificultad más exigente (clasificarDificultad).</w:t>
       </w:r>
     </w:p>
     <w:p>
@@ -41143,7 +41143,7 @@
                 <w:sz w:val="17"/>
                 <w:szCs w:val="17"/>
               </w:rPr>
-              <w:t xml:space="preserve">Alta de otro horario en un tramo conocido con llegada sugerida y editable, y rechazo de un horario físicamente imposible (RF-12, validación).</w:t>
+              <w:t xml:space="preserve">Alta de otro horario en un tramo conocido con llegada sugerida y editable, y rechazo de un horario físicamente imposible (RF-13, validación).</w:t>
             </w:r>
           </w:p>
         </w:tc>

</xml_diff>

<commit_message>
Geoselector: proponer la estacion activa mas cercana al pin
Al fijar o mover el pin (clic, arrastre o coordenadas tecleadas) el modal
selecciona la estacion activa mas proxima y lo indica en la distancia; el
select sigue siendo editable y, si el operador elige otra, se le muestra
cual es la mas cercana. Al editar una zona guardada no se cambia su
estacion. Documento: 5.1 y CU-04 paso 2. E2E verificado; 145 pruebas.

Co-Authored-By: Claude Opus 5 <noreply@anthropic.com>
Claude-Session: https://claude.ai/code/session_01UthhjmQUHuLMAF9YwENp9x
</commit_message>
<xml_diff>
--- a/docs/ProyectoFinalSOftware.docx
+++ b/docs/ProyectoFinalSOftware.docx
@@ -5764,14 +5764,7 @@
                 <w:szCs w:val="18"/>
               </w:rPr>
               <w:lastRenderedPageBreak/>
-              <w:t xml:space="preserve">2) </w:t>
-            </w:r>
-            <w:r>
-              <w:rPr>
-                <w:sz w:val="18"/>
-                <w:szCs w:val="18"/>
-              </w:rPr>
-              <w:t>Ingresa o edita el nombre, descripción, una o más preferencias, costo aproximado, estación cercana y selecciona la ubicación en el mapa interactivo (o ingresa las coordenadas).</w:t>
+              <w:t xml:space="preserve">2) Ingresa o edita el nombre, descripción, una o más preferencias, costo aproximado y selecciona la ubicación en el mapa interactivo (o ingresa las coordenadas); el sistema propone la estación activa más cercana al punto, que puede cambiarse.</w:t>
             </w:r>
           </w:p>
           <w:p>
@@ -14223,7 +14216,7 @@
       <w:r>
         <w:t xml:space="preserve">) que dibuja automáticamente el trazo en línea recta (Haversine), garantizando que el mapa nunca quede vacío. El mismo mapa es multimodal: al elegir un servicio en el selector de trenes, dibuja el tramo ferroviario desde la estación de abordaje hasta la de partida siguiendo el trazado real de las vías de PeruRail, que se conserva como un GeoJSON estático extraído de OpenStreetMap (script </w:t>
         <w:lastRenderedPageBreak/>
-        <w:t>scripts/descargar_red_ferroviaria.py) y se recorre con el algoritmo de Dijkstra en el navegador; si la red no está disponible o una estación queda lejos de la vía, se traza una recta rotulada como esquemática. Leaflet.js se reutiliza además en el módulo administrativo de Travel Group Perú como geoselector interactivo: en el modal de registro y actualización de zonas, el operador fija la ubicación con un clic o arrastrando el marcador y el formulario captura la latitud y la longitud sin digitación manual, mostrando la estación de referencia y la distancia caminable clasificada con la tabla dificultad.</w:t>
+        <w:t>scripts/descargar_red_ferroviaria.py) y se recorre con el algoritmo de Dijkstra en el navegador; si la red no está disponible o una estación queda lejos de la vía, se traza una recta rotulada como esquemática. Leaflet.js se reutiliza además en el módulo administrativo de Travel Group Perú como geoselector interactivo: en el modal de registro y actualización de zonas, el operador fija la ubicación con un clic o arrastrando el marcador y el formulario captura la latitud y la longitud sin digitación manual, selecciona automáticamente la estación activa más cercana al punto (editable si el acceso habitual es otro) y muestra la distancia caminable clasificada con la tabla dificultad.</w:t>
       </w:r>
     </w:p>
     <w:p>

</xml_diff>

<commit_message>
Geoselector con todas las estaciones y alta de preferencias desde el modal
El mapa del modal de zonas muestra siempre las estaciones activas como
iconos de tren pequenos (tooltip con el nombre, pulsar uno la elige) y
abre encuadrandolas todas; la elegida se resalta y un clic desde la vista
general acerca el mapa para afinar. Preferencias: alta en linea con
POST /zonas/preferencias (fetch + CSRF, JSON), validacion en
ZonaTuristicaService.registrarPreferencia (obligatorio, 30/150
caracteres, duplicado sin distinguir mayusculas) y traza en auditoria;
la casilla nueva aparece marcada sin perder lo escrito. Documento: CU-04,
5.1, diccionario, 8.2.1, CN-23 y CB-20/21. 148 pruebas en verde.

Co-Authored-By: Claude Opus 5 <noreply@anthropic.com>
Claude-Session: https://claude.ai/code/session_01UthhjmQUHuLMAF9YwENp9x
</commit_message>
<xml_diff>
--- a/docs/ProyectoFinalSOftware.docx
+++ b/docs/ProyectoFinalSOftware.docx
@@ -5764,7 +5764,7 @@
                 <w:szCs w:val="18"/>
               </w:rPr>
               <w:lastRenderedPageBreak/>
-              <w:t xml:space="preserve">2) Ingresa o edita el nombre, descripción, una o más preferencias, costo aproximado y selecciona la ubicación en el mapa interactivo (o ingresa las coordenadas); el sistema propone la estación activa más cercana al punto, que puede cambiarse.</w:t>
+              <w:t xml:space="preserve">2) Ingresa o edita el nombre, descripción, una o más preferencias, costo aproximado y selecciona la ubicación en el mapa interactivo (o ingresa las coordenadas), donde se muestran todas las estaciones activas; el sistema propone la más cercana al punto, que puede cambiarse pulsando otra. Si falta una categoría, crea la preferencia desde el propio formulario.</w:t>
             </w:r>
           </w:p>
           <w:p>
@@ -14216,7 +14216,7 @@
       <w:r>
         <w:t xml:space="preserve">) que dibuja automáticamente el trazo en línea recta (Haversine), garantizando que el mapa nunca quede vacío. El mismo mapa es multimodal: al elegir un servicio en el selector de trenes, dibuja el tramo ferroviario desde la estación de abordaje hasta la de partida siguiendo el trazado real de las vías de PeruRail, que se conserva como un GeoJSON estático extraído de OpenStreetMap (script </w:t>
         <w:lastRenderedPageBreak/>
-        <w:t>scripts/descargar_red_ferroviaria.py) y se recorre con el algoritmo de Dijkstra en el navegador; si la red no está disponible o una estación queda lejos de la vía, se traza una recta rotulada como esquemática. Leaflet.js se reutiliza además en el módulo administrativo de Travel Group Perú como geoselector interactivo: en el modal de registro y actualización de zonas, el operador fija la ubicación con un clic o arrastrando el marcador y el formulario captura la latitud y la longitud sin digitación manual, selecciona automáticamente la estación activa más cercana al punto (editable si el acceso habitual es otro) y muestra la distancia caminable clasificada con la tabla dificultad.</w:t>
+        <w:t>scripts/descargar_red_ferroviaria.py) y se recorre con el algoritmo de Dijkstra en el navegador; si la red no está disponible o una estación queda lejos de la vía, se traza una recta rotulada como esquemática. Leaflet.js se reutiliza además en el módulo administrativo de Travel Group Perú como geoselector interactivo: en el modal de registro y actualización de zonas, el operador fija la ubicación con un clic o arrastrando el marcador y el formulario captura la latitud y la longitud sin digitación manual, muestra todas las estaciones activas, selecciona automáticamente la más cercana al punto (editable si el acceso habitual es otro, incluso pulsando su marcador) y muestra la distancia caminable clasificada con la tabla dificultad. Desde el mismo modal se dan de alta preferencias nuevas (POST /zonas/preferencias por fetch), que se añaden como casilla sin perder lo escrito y quedan en auditoría.</w:t>
       </w:r>
     </w:p>
     <w:p>
@@ -18422,7 +18422,7 @@
                 <w:sz w:val="17"/>
                 <w:szCs w:val="17"/>
               </w:rPr>
-              <w:t>Nombre de la preferencia turística (Ej.: Aventura, Naturaleza, Historia/Cultura, Gastronomía). Valor único.</w:t>
+              <w:t>Nombre de la preferencia turística (Ej.: Aventura, Naturaleza, Historia/Cultura, Gastronomía). Valor único, sin distinguir mayúsculas al crearlo. Travel Group Perú puede añadir nuevos desde el modal de zonas (RNF-06), con traza en AuditoriaLog.</w:t>
             </w:r>
           </w:p>
         </w:tc>
@@ -34475,7 +34475,7 @@
         <w:t xml:space="preserve">Componentes Evaluados: </w:t>
       </w:r>
       <w:r>
-        <w:t xml:space="preserve"> RutaPeatonalService, SenamhiClient, PeruRailClient, AforoService, TarifaService, AuditoriaService, ServicioTrenService, InformeService y UsuarioService. Las pruebas se concentran en los métodos encargados de calcular la ruta peatonal (calcularRutaPeatonalIdaVuelta), procesar el feed climático (procesarFeedSenamhi), validar la tarifa del tren (validarTarifaPeruRail), validar el aforo disponible de una zona turística para todo el grupo (validarAforoDisponible), resolver la categoría tarifaria que corresponde a cada edad (categoriaPorEdad), registrar la auditoría de las operaciones administrativas (registrarAuditoria), eliminar servicios de tren registrando su trazabilidad en auditoría (eliminar), consultar el historial de informes por usuario autenticado (obtenerInformesPorUsuario), derivar y validar los horarios y la velocidad de un servicio de tren (completarTiempoTransito, guardar, validarVelocidadFisica), dar de alta una cuenta de turista (registrarTurista) y acotar el circuito caminable al tope del nivel de dificultad más exigente (clasificarDificultad).</w:t>
+        <w:t xml:space="preserve"> RutaPeatonalService, SenamhiClient, PeruRailClient, AforoService, TarifaService, AuditoriaService, ServicioTrenService, InformeService y UsuarioService. Las pruebas se concentran en los métodos encargados de calcular la ruta peatonal (calcularRutaPeatonalIdaVuelta), procesar el feed climático (procesarFeedSenamhi), validar la tarifa del tren (validarTarifaPeruRail), validar el aforo disponible de una zona turística para todo el grupo (validarAforoDisponible), resolver la categoría tarifaria que corresponde a cada edad (categoriaPorEdad), registrar la auditoría de las operaciones administrativas (registrarAuditoria), eliminar servicios de tren registrando su trazabilidad en auditoría (eliminar), consultar el historial de informes por usuario autenticado (obtenerInformesPorUsuario), derivar y validar los horarios y la velocidad de un servicio de tren (completarTiempoTransito, guardar, validarVelocidadFisica), dar de alta una cuenta de turista (registrarTurista) acotar el circuito caminable al tope del nivel de dificultad más exigente (clasificarDificultad) y crear preferencias turísticas desde el mantenimiento de zonas (registrarPreferencia).</w:t>
       </w:r>
     </w:p>
     <w:p>
@@ -37176,6 +37176,270 @@
           </w:p>
         </w:tc>
       </w:tr>
+      <w:tr>
+        <w:trPr>
+          <w:cantSplit/>
+        </w:trPr>
+        <w:tc>
+          <w:tcPr>
+            <w:tcW w:w="184" w:type="pct"/>
+            <w:tcMar>
+              <w:top w:w="60" w:type="dxa"/>
+              <w:left w:w="80" w:type="dxa"/>
+              <w:bottom w:w="60" w:type="dxa"/>
+              <w:right w:w="80" w:type="dxa"/>
+            </w:tcMar>
+            <w:vAlign w:val="center"/>
+          </w:tcPr>
+          <w:p>
+            <w:r>
+              <w:rPr>
+                <w:sz w:val="17"/>
+                <w:szCs w:val="17"/>
+              </w:rPr>
+              <w:lastRenderedPageBreak/>
+              <w:t xml:space="preserve">CB-20</w:t>
+            </w:r>
+          </w:p>
+        </w:tc>
+        <w:tc>
+          <w:tcPr>
+            <w:tcW w:w="1111" w:type="pct"/>
+            <w:tcMar>
+              <w:top w:w="60" w:type="dxa"/>
+              <w:left w:w="80" w:type="dxa"/>
+              <w:bottom w:w="60" w:type="dxa"/>
+              <w:right w:w="80" w:type="dxa"/>
+            </w:tcMar>
+            <w:vAlign w:val="center"/>
+          </w:tcPr>
+          <w:p>
+            <w:r>
+              <w:rPr>
+                <w:sz w:val="17"/>
+                <w:szCs w:val="17"/>
+              </w:rPr>
+              <w:t xml:space="preserve">registrarPreferencia()</w:t>
+            </w:r>
+          </w:p>
+        </w:tc>
+        <w:tc>
+          <w:tcPr>
+            <w:tcW w:w="817" w:type="pct"/>
+            <w:tcMar>
+              <w:top w:w="60" w:type="dxa"/>
+              <w:left w:w="80" w:type="dxa"/>
+              <w:bottom w:w="60" w:type="dxa"/>
+              <w:right w:w="80" w:type="dxa"/>
+            </w:tcMar>
+            <w:vAlign w:val="center"/>
+          </w:tcPr>
+          <w:p>
+            <w:r>
+              <w:rPr>
+                <w:sz w:val="17"/>
+                <w:szCs w:val="17"/>
+              </w:rPr>
+              <w:t xml:space="preserve">Ruta A (Cumple condición): nombre nuevo; el sistema lo recorta, guarda la preferencia y deja traza INSERT en AuditoriaLog a nombre del operador.</w:t>
+            </w:r>
+          </w:p>
+        </w:tc>
+        <w:tc>
+          <w:tcPr>
+            <w:tcW w:w="1317" w:type="pct"/>
+            <w:tcMar>
+              <w:top w:w="60" w:type="dxa"/>
+              <w:left w:w="80" w:type="dxa"/>
+              <w:bottom w:w="60" w:type="dxa"/>
+              <w:right w:w="80" w:type="dxa"/>
+            </w:tcMar>
+            <w:vAlign w:val="center"/>
+          </w:tcPr>
+          <w:p>
+            <w:r>
+              <w:rPr>
+                <w:sz w:val="17"/>
+                <w:szCs w:val="17"/>
+              </w:rPr>
+              <w:t xml:space="preserve">nombre=«  Astronomía »; descripcion=«Cielos del altiplano »; usuario=travel_ana</w:t>
+            </w:r>
+          </w:p>
+        </w:tc>
+        <w:tc>
+          <w:tcPr>
+            <w:tcW w:w="1264" w:type="pct"/>
+            <w:tcMar>
+              <w:top w:w="60" w:type="dxa"/>
+              <w:left w:w="80" w:type="dxa"/>
+              <w:bottom w:w="60" w:type="dxa"/>
+              <w:right w:w="80" w:type="dxa"/>
+            </w:tcMar>
+            <w:vAlign w:val="center"/>
+          </w:tcPr>
+          <w:p>
+            <w:r>
+              <w:rPr>
+                <w:sz w:val="17"/>
+                <w:szCs w:val="17"/>
+              </w:rPr>
+              <w:t xml:space="preserve">return Preferencia{id=9, nombre=Astronomía, descripcion=Cielos del altiplano} + AuditoriaLog INSERT preferencia ("PreNombre=Astronomía; PreDescripcion=Cielos del altiplano").</w:t>
+            </w:r>
+          </w:p>
+        </w:tc>
+        <w:tc>
+          <w:tcPr>
+            <w:tcW w:w="307" w:type="pct"/>
+            <w:tcMar>
+              <w:top w:w="60" w:type="dxa"/>
+              <w:left w:w="80" w:type="dxa"/>
+              <w:bottom w:w="60" w:type="dxa"/>
+              <w:right w:w="80" w:type="dxa"/>
+            </w:tcMar>
+            <w:vAlign w:val="center"/>
+          </w:tcPr>
+          <w:p>
+            <w:r>
+              <w:rPr>
+                <w:sz w:val="17"/>
+                <w:szCs w:val="17"/>
+              </w:rPr>
+              <w:t xml:space="preserve">Exitoso</w:t>
+            </w:r>
+          </w:p>
+        </w:tc>
+      </w:tr>
+      <w:tr>
+        <w:trPr>
+          <w:cantSplit/>
+        </w:trPr>
+        <w:tc>
+          <w:tcPr>
+            <w:tcW w:w="184" w:type="pct"/>
+            <w:tcMar>
+              <w:top w:w="60" w:type="dxa"/>
+              <w:left w:w="80" w:type="dxa"/>
+              <w:bottom w:w="60" w:type="dxa"/>
+              <w:right w:w="80" w:type="dxa"/>
+            </w:tcMar>
+            <w:vAlign w:val="center"/>
+          </w:tcPr>
+          <w:p>
+            <w:r>
+              <w:rPr>
+                <w:sz w:val="17"/>
+                <w:szCs w:val="17"/>
+              </w:rPr>
+              <w:lastRenderedPageBreak/>
+              <w:t xml:space="preserve">CB-21</w:t>
+            </w:r>
+          </w:p>
+        </w:tc>
+        <w:tc>
+          <w:tcPr>
+            <w:tcW w:w="1111" w:type="pct"/>
+            <w:tcMar>
+              <w:top w:w="60" w:type="dxa"/>
+              <w:left w:w="80" w:type="dxa"/>
+              <w:bottom w:w="60" w:type="dxa"/>
+              <w:right w:w="80" w:type="dxa"/>
+            </w:tcMar>
+            <w:vAlign w:val="center"/>
+          </w:tcPr>
+          <w:p>
+            <w:r>
+              <w:rPr>
+                <w:sz w:val="17"/>
+                <w:szCs w:val="17"/>
+              </w:rPr>
+              <w:t xml:space="preserve">registrarPreferencia()</w:t>
+            </w:r>
+          </w:p>
+        </w:tc>
+        <w:tc>
+          <w:tcPr>
+            <w:tcW w:w="817" w:type="pct"/>
+            <w:tcMar>
+              <w:top w:w="60" w:type="dxa"/>
+              <w:left w:w="80" w:type="dxa"/>
+              <w:bottom w:w="60" w:type="dxa"/>
+              <w:right w:w="80" w:type="dxa"/>
+            </w:tcMar>
+            <w:vAlign w:val="center"/>
+          </w:tcPr>
+          <w:p>
+            <w:r>
+              <w:rPr>
+                <w:sz w:val="17"/>
+                <w:szCs w:val="17"/>
+              </w:rPr>
+              <w:t xml:space="preserve">Ruta B (Falso): ya existe una preferencia con el mismo nombre sin distinguir mayúsculas, o el nombre llega vacío o supera los 30 caracteres; el sistema rechaza el alta antes de persistir.</w:t>
+            </w:r>
+          </w:p>
+        </w:tc>
+        <w:tc>
+          <w:tcPr>
+            <w:tcW w:w="1317" w:type="pct"/>
+            <w:tcMar>
+              <w:top w:w="60" w:type="dxa"/>
+              <w:left w:w="80" w:type="dxa"/>
+              <w:bottom w:w="60" w:type="dxa"/>
+              <w:right w:w="80" w:type="dxa"/>
+            </w:tcMar>
+            <w:vAlign w:val="center"/>
+          </w:tcPr>
+          <w:p>
+            <w:r>
+              <w:rPr>
+                <w:sz w:val="17"/>
+                <w:szCs w:val="17"/>
+              </w:rPr>
+              <w:t xml:space="preserve">nombre=«GASTRONOMIA» (existe «Gastronomia») · nombre=«   » · nombre de 31 caracteres</w:t>
+            </w:r>
+          </w:p>
+        </w:tc>
+        <w:tc>
+          <w:tcPr>
+            <w:tcW w:w="1264" w:type="pct"/>
+            <w:tcMar>
+              <w:top w:w="60" w:type="dxa"/>
+              <w:left w:w="80" w:type="dxa"/>
+              <w:bottom w:w="60" w:type="dxa"/>
+              <w:right w:w="80" w:type="dxa"/>
+            </w:tcMar>
+            <w:vAlign w:val="center"/>
+          </w:tcPr>
+          <w:p>
+            <w:r>
+              <w:rPr>
+                <w:sz w:val="17"/>
+                <w:szCs w:val="17"/>
+              </w:rPr>
+              <w:t xml:space="preserve">throw IllegalArgumentException("Ya existe la preferencia «Gastronomia»") / ("El nombre de la preferencia es obligatorio") / ("…no puede superar los 30 caracteres"). Sin save ni auditoría.</w:t>
+            </w:r>
+          </w:p>
+        </w:tc>
+        <w:tc>
+          <w:tcPr>
+            <w:tcW w:w="307" w:type="pct"/>
+            <w:tcMar>
+              <w:top w:w="60" w:type="dxa"/>
+              <w:left w:w="80" w:type="dxa"/>
+              <w:bottom w:w="60" w:type="dxa"/>
+              <w:right w:w="80" w:type="dxa"/>
+            </w:tcMar>
+            <w:vAlign w:val="center"/>
+          </w:tcPr>
+          <w:p>
+            <w:r>
+              <w:rPr>
+                <w:sz w:val="17"/>
+                <w:szCs w:val="17"/>
+              </w:rPr>
+              <w:t xml:space="preserve">Exitoso</w:t>
+            </w:r>
+          </w:p>
+        </w:tc>
+      </w:tr>
     </w:tbl>
     <w:p>
       <w:pPr>
@@ -41673,6 +41937,261 @@
                 <w:szCs w:val="17"/>
               </w:rPr>
               <w:t>Exitoso</w:t>
+            </w:r>
+          </w:p>
+        </w:tc>
+      </w:tr>
+      <w:tr>
+        <w:trPr>
+          <w:cantSplit/>
+        </w:trPr>
+        <w:tc>
+          <w:tcPr>
+            <w:tcW w:w="217" w:type="pct"/>
+            <w:tcMar>
+              <w:top w:w="60" w:type="dxa"/>
+              <w:left w:w="80" w:type="dxa"/>
+              <w:bottom w:w="60" w:type="dxa"/>
+              <w:right w:w="80" w:type="dxa"/>
+            </w:tcMar>
+            <w:vAlign w:val="center"/>
+          </w:tcPr>
+          <w:p>
+            <w:pPr>
+              <w:rPr>
+                <w:sz w:val="17"/>
+                <w:szCs w:val="17"/>
+              </w:rPr>
+            </w:pPr>
+            <w:r>
+              <w:rPr>
+                <w:sz w:val="17"/>
+                <w:szCs w:val="17"/>
+              </w:rPr>
+              <w:lastRenderedPageBreak/>
+              <w:t xml:space="preserve">CN-23</w:t>
+            </w:r>
+          </w:p>
+        </w:tc>
+        <w:tc>
+          <w:tcPr>
+            <w:tcW w:w="624" w:type="pct"/>
+            <w:tcMar>
+              <w:top w:w="60" w:type="dxa"/>
+              <w:left w:w="80" w:type="dxa"/>
+              <w:bottom w:w="60" w:type="dxa"/>
+              <w:right w:w="80" w:type="dxa"/>
+            </w:tcMar>
+            <w:vAlign w:val="center"/>
+          </w:tcPr>
+          <w:p>
+            <w:pPr>
+              <w:rPr>
+                <w:sz w:val="17"/>
+                <w:szCs w:val="17"/>
+              </w:rPr>
+            </w:pPr>
+            <w:r>
+              <w:rPr>
+                <w:sz w:val="17"/>
+                <w:szCs w:val="17"/>
+              </w:rPr>
+              <w:t xml:space="preserve">Elegir la ubicación y la estación de una zona en el mapa y crear una preferencia nueva desde el modal (RF-11, RNF-06, RNF-07).</w:t>
+            </w:r>
+          </w:p>
+        </w:tc>
+        <w:tc>
+          <w:tcPr>
+            <w:tcW w:w="971" w:type="pct"/>
+            <w:tcMar>
+              <w:top w:w="60" w:type="dxa"/>
+              <w:left w:w="80" w:type="dxa"/>
+              <w:bottom w:w="60" w:type="dxa"/>
+              <w:right w:w="80" w:type="dxa"/>
+            </w:tcMar>
+            <w:vAlign w:val="center"/>
+          </w:tcPr>
+          <w:p>
+            <w:pPr>
+              <w:rPr>
+                <w:sz w:val="17"/>
+                <w:szCs w:val="17"/>
+              </w:rPr>
+            </w:pPr>
+            <w:r>
+              <w:rPr>
+                <w:sz w:val="17"/>
+                <w:szCs w:val="17"/>
+              </w:rPr>
+              <w:t xml:space="preserve">Sesión iniciada como Travel Group Perú. Existen 7 estaciones activas y las 4 preferencias sembradas.</w:t>
+            </w:r>
+          </w:p>
+        </w:tc>
+        <w:tc>
+          <w:tcPr>
+            <w:tcW w:w="765" w:type="pct"/>
+            <w:tcMar>
+              <w:top w:w="60" w:type="dxa"/>
+              <w:left w:w="80" w:type="dxa"/>
+              <w:bottom w:w="60" w:type="dxa"/>
+              <w:right w:w="80" w:type="dxa"/>
+            </w:tcMar>
+            <w:vAlign w:val="center"/>
+          </w:tcPr>
+          <w:p>
+            <w:pPr>
+              <w:rPr>
+                <w:sz w:val="17"/>
+                <w:szCs w:val="17"/>
+              </w:rPr>
+            </w:pPr>
+            <w:r>
+              <w:rPr>
+                <w:sz w:val="17"/>
+                <w:szCs w:val="17"/>
+              </w:rPr>
+              <w:t xml:space="preserve">1) Pulsar «Nueva zona» y observar el mapa.</w:t>
+            </w:r>
+          </w:p>
+          <w:p>
+            <w:pPr>
+              <w:rPr>
+                <w:sz w:val="17"/>
+                <w:szCs w:val="17"/>
+              </w:rPr>
+            </w:pPr>
+            <w:r>
+              <w:rPr>
+                <w:sz w:val="17"/>
+                <w:szCs w:val="17"/>
+              </w:rPr>
+              <w:t xml:space="preserve">2) Pulsar el marcador de la estación Puno.</w:t>
+            </w:r>
+          </w:p>
+          <w:p>
+            <w:pPr>
+              <w:rPr>
+                <w:sz w:val="17"/>
+                <w:szCs w:val="17"/>
+              </w:rPr>
+            </w:pPr>
+            <w:r>
+              <w:rPr>
+                <w:sz w:val="17"/>
+                <w:szCs w:val="17"/>
+              </w:rPr>
+              <w:t xml:space="preserve">3) Hacer clic en el mapa cerca de Ollantaytambo y arrastrar el pin.</w:t>
+            </w:r>
+          </w:p>
+          <w:p>
+            <w:pPr>
+              <w:rPr>
+                <w:sz w:val="17"/>
+                <w:szCs w:val="17"/>
+              </w:rPr>
+            </w:pPr>
+            <w:r>
+              <w:rPr>
+                <w:sz w:val="17"/>
+                <w:szCs w:val="17"/>
+              </w:rPr>
+              <w:t xml:space="preserve">4) Escribir «Astronomía» como nueva preferencia y pulsar Enter; repetir con «gastronomia».</w:t>
+            </w:r>
+          </w:p>
+          <w:p>
+            <w:pPr>
+              <w:rPr>
+                <w:sz w:val="17"/>
+                <w:szCs w:val="17"/>
+              </w:rPr>
+            </w:pPr>
+            <w:r>
+              <w:rPr>
+                <w:sz w:val="17"/>
+                <w:szCs w:val="17"/>
+              </w:rPr>
+              <w:t xml:space="preserve">5) Completar nombre y costo y guardar.</w:t>
+            </w:r>
+          </w:p>
+        </w:tc>
+        <w:tc>
+          <w:tcPr>
+            <w:tcW w:w="1316" w:type="pct"/>
+            <w:tcMar>
+              <w:top w:w="60" w:type="dxa"/>
+              <w:left w:w="80" w:type="dxa"/>
+              <w:bottom w:w="60" w:type="dxa"/>
+              <w:right w:w="80" w:type="dxa"/>
+            </w:tcMar>
+            <w:vAlign w:val="center"/>
+          </w:tcPr>
+          <w:p>
+            <w:pPr>
+              <w:rPr>
+                <w:sz w:val="17"/>
+                <w:szCs w:val="17"/>
+              </w:rPr>
+            </w:pPr>
+            <w:r>
+              <w:rPr>
+                <w:sz w:val="17"/>
+                <w:szCs w:val="17"/>
+              </w:rPr>
+              <w:t xml:space="preserve">Clic en el mapa; Nueva preferencia=«Astronomía» (descripción «Cielos del altiplano»); luego «gastronomia»; Nombre=«Zona con preferencia nueva»; Costo=5.00</w:t>
+            </w:r>
+          </w:p>
+        </w:tc>
+        <w:tc>
+          <w:tcPr>
+            <w:tcW w:w="761" w:type="pct"/>
+            <w:tcMar>
+              <w:top w:w="60" w:type="dxa"/>
+              <w:left w:w="80" w:type="dxa"/>
+              <w:bottom w:w="60" w:type="dxa"/>
+              <w:right w:w="80" w:type="dxa"/>
+            </w:tcMar>
+            <w:vAlign w:val="center"/>
+          </w:tcPr>
+          <w:p>
+            <w:pPr>
+              <w:rPr>
+                <w:sz w:val="17"/>
+                <w:szCs w:val="17"/>
+              </w:rPr>
+            </w:pPr>
+            <w:r>
+              <w:rPr>
+                <w:sz w:val="17"/>
+                <w:szCs w:val="17"/>
+              </w:rPr>
+              <w:t xml:space="preserve">El mapa abre encuadrando las 7 estaciones activas como iconos de tren pequeños; al pulsar Puno queda resaltada y elegida en el selector. El clic coloca el pin verde, acerca el mapa, rellena latitud y longitud y cambia la estación a la más cercana con su distancia («A ~0.6 km de Estacion Ollantaytambo, la estación activa más cercana…»). «Astronomía» se crea sin cerrar el modal y aparece como casilla marcada; «gastronomia» se rechaza con «Ya existe la preferencia «Gastronomia»». La zona se guarda con la preferencia nueva, que también aparece en el buscador del turista, y AuditoriaLog registra el INSERT de la preferencia y el de la zona.</w:t>
+            </w:r>
+          </w:p>
+        </w:tc>
+        <w:tc>
+          <w:tcPr>
+            <w:tcW w:w="346" w:type="pct"/>
+            <w:tcMar>
+              <w:top w:w="60" w:type="dxa"/>
+              <w:left w:w="80" w:type="dxa"/>
+              <w:bottom w:w="60" w:type="dxa"/>
+              <w:right w:w="80" w:type="dxa"/>
+            </w:tcMar>
+            <w:vAlign w:val="center"/>
+          </w:tcPr>
+          <w:p>
+            <w:pPr>
+              <w:rPr>
+                <w:sz w:val="17"/>
+                <w:szCs w:val="17"/>
+              </w:rPr>
+            </w:pPr>
+            <w:r>
+              <w:rPr>
+                <w:sz w:val="17"/>
+                <w:szCs w:val="17"/>
+              </w:rPr>
+              <w:t xml:space="preserve">Exitoso</w:t>
             </w:r>
           </w:p>
         </w:tc>

</xml_diff>

<commit_message>
Documento: seccion 9, conclusiones y recomendaciones
Cierra el informe con las conclusiones alineadas a los objetivos de 1.3
(integracion de las tres fuentes, buscador y motor de rutas, informe y
aforo, paneles parametrizables y calidad con 148 pruebas) y con las
recomendaciones de trabajo futuro. Entradas nuevas en el indice y
actualizacion automatica de campos al abrir en Word.

Co-Authored-By: Claude Opus 5 <noreply@anthropic.com>
Claude-Session: https://claude.ai/code/session_01UthhjmQUHuLMAF9YwENp9x
</commit_message>
<xml_diff>
--- a/docs/ProyectoFinalSOftware.docx
+++ b/docs/ProyectoFinalSOftware.docx
@@ -2136,6 +2136,123 @@
           </w:hyperlink>
         </w:p>
         <w:p>
+          <w:pPr>
+            <w:pStyle w:val="TDC1"/>
+            <w:tabs>
+              <w:tab w:val="right" w:leader="dot" w:pos="8494"/>
+            </w:tabs>
+            <w:rPr>
+              <w:rFonts w:asciiTheme="minorHAnsi" w:eastAsiaTheme="minorEastAsia" w:hAnsiTheme="minorHAnsi" w:cstheme="minorBidi"/>
+              <w:noProof/>
+              <w:kern w:val="2"/>
+              <w:sz w:val="24"/>
+              <w:szCs w:val="24"/>
+              <w14:ligatures w14:val="standardContextual"/>
+            </w:rPr>
+          </w:pPr>
+          <w:hyperlink w:anchor="_Toc239283088" w:history="1">
+            <w:r>
+              <w:rPr>
+                <w:rStyle w:val="Hipervnculo"/>
+                <w:b/>
+                <w:bCs/>
+                <w:noProof/>
+              </w:rPr>
+              <w:t>9. Conclusiones y recomendaciones</w:t>
+            </w:r>
+            <w:r>
+              <w:rPr>
+                <w:noProof/>
+                <w:webHidden/>
+              </w:rPr>
+              <w:tab/>
+              <w:fldChar w:fldCharType="begin"/>
+              <w:instrText xml:space="preserve"> PAGEREF _Toc239283088 \h </w:instrText>
+              <w:fldChar w:fldCharType="separate"/>
+              <w:t>59</w:t>
+              <w:fldChar w:fldCharType="end"/>
+            </w:r>
+          </w:hyperlink>
+        </w:p>
+        <w:p>
+          <w:pPr>
+            <w:pStyle w:val="TDC2"/>
+            <w:tabs>
+              <w:tab w:val="right" w:leader="dot" w:pos="8494"/>
+            </w:tabs>
+            <w:rPr>
+              <w:rFonts w:asciiTheme="minorHAnsi" w:eastAsiaTheme="minorEastAsia" w:hAnsiTheme="minorHAnsi" w:cstheme="minorBidi"/>
+              <w:noProof/>
+              <w:kern w:val="2"/>
+              <w:sz w:val="24"/>
+              <w:szCs w:val="24"/>
+              <w14:ligatures w14:val="standardContextual"/>
+            </w:rPr>
+          </w:pPr>
+          <w:hyperlink w:anchor="_Toc239283089" w:history="1">
+            <w:r>
+              <w:rPr>
+                <w:rStyle w:val="Hipervnculo"/>
+                <w:b/>
+                <w:bCs/>
+                <w:noProof/>
+              </w:rPr>
+              <w:t>9.1. Conclusiones</w:t>
+            </w:r>
+            <w:r>
+              <w:rPr>
+                <w:noProof/>
+                <w:webHidden/>
+              </w:rPr>
+              <w:tab/>
+              <w:fldChar w:fldCharType="begin"/>
+              <w:instrText xml:space="preserve"> PAGEREF _Toc239283089 \h </w:instrText>
+              <w:fldChar w:fldCharType="separate"/>
+              <w:t>59</w:t>
+              <w:fldChar w:fldCharType="end"/>
+            </w:r>
+          </w:hyperlink>
+        </w:p>
+        <w:p>
+          <w:pPr>
+            <w:pStyle w:val="TDC2"/>
+            <w:tabs>
+              <w:tab w:val="right" w:leader="dot" w:pos="8494"/>
+            </w:tabs>
+            <w:rPr>
+              <w:rFonts w:asciiTheme="minorHAnsi" w:eastAsiaTheme="minorEastAsia" w:hAnsiTheme="minorHAnsi" w:cstheme="minorBidi"/>
+              <w:noProof/>
+              <w:kern w:val="2"/>
+              <w:sz w:val="24"/>
+              <w:szCs w:val="24"/>
+              <w14:ligatures w14:val="standardContextual"/>
+            </w:rPr>
+          </w:pPr>
+          <w:hyperlink w:anchor="_Toc239283090" w:history="1">
+            <w:r>
+              <w:rPr>
+                <w:rStyle w:val="Hipervnculo"/>
+                <w:b/>
+                <w:bCs/>
+                <w:noProof/>
+              </w:rPr>
+              <w:t>9.2. Recomendaciones y trabajo futuro</w:t>
+            </w:r>
+            <w:r>
+              <w:rPr>
+                <w:noProof/>
+                <w:webHidden/>
+              </w:rPr>
+              <w:tab/>
+              <w:fldChar w:fldCharType="begin"/>
+              <w:instrText xml:space="preserve"> PAGEREF _Toc239283090 \h </w:instrText>
+              <w:fldChar w:fldCharType="separate"/>
+              <w:t>60</w:t>
+              <w:fldChar w:fldCharType="end"/>
+            </w:r>
+          </w:hyperlink>
+        </w:p>
+        <w:p>
           <w:r>
             <w:rPr>
               <w:b/>
@@ -42197,6 +42314,230 @@
         </w:tc>
       </w:tr>
     </w:tbl>
+    <w:p>
+      <w:pPr>
+        <w:spacing w:line="278" w:lineRule="auto"/>
+      </w:pPr>
+      <w:r>
+        <w:br w:type="page"/>
+      </w:r>
+    </w:p>
+    <w:p>
+      <w:pPr>
+        <w:pStyle w:val="Ttulo1"/>
+        <w:rPr>
+          <w:rFonts w:ascii="Calibri" w:hAnsi="Calibri" w:cs="Calibri"/>
+          <w:b/>
+          <w:bCs/>
+          <w:color w:val="auto"/>
+          <w:sz w:val="28"/>
+          <w:szCs w:val="28"/>
+        </w:rPr>
+      </w:pPr>
+      <w:bookmarkStart w:id="36" w:name="_Toc239283088"/>
+      <w:r>
+        <w:rPr>
+          <w:rFonts w:ascii="Calibri" w:hAnsi="Calibri" w:cs="Calibri"/>
+          <w:b/>
+          <w:bCs/>
+          <w:color w:val="auto"/>
+          <w:sz w:val="28"/>
+          <w:szCs w:val="28"/>
+        </w:rPr>
+        <w:t>9. Conclusiones y recomendaciones</w:t>
+      </w:r>
+      <w:bookmarkEnd w:id="36"/>
+    </w:p>
+    <w:p>
+      <w:pPr>
+        <w:pStyle w:val="Ttulo2"/>
+        <w:rPr>
+          <w:rFonts w:ascii="Calibri" w:hAnsi="Calibri" w:cs="Calibri"/>
+          <w:b/>
+          <w:bCs/>
+          <w:color w:val="auto"/>
+          <w:sz w:val="24"/>
+          <w:szCs w:val="24"/>
+        </w:rPr>
+      </w:pPr>
+      <w:r>
+        <w:tab/>
+      </w:r>
+      <w:bookmarkStart w:id="37" w:name="_Toc239283089"/>
+      <w:r>
+        <w:rPr>
+          <w:rFonts w:ascii="Calibri" w:hAnsi="Calibri" w:cs="Calibri"/>
+          <w:b/>
+          <w:bCs/>
+          <w:color w:val="auto"/>
+          <w:sz w:val="24"/>
+          <w:szCs w:val="24"/>
+        </w:rPr>
+        <w:t>9.1. Conclusiones</w:t>
+      </w:r>
+      <w:bookmarkEnd w:id="37"/>
+    </w:p>
+    <w:p>
+      <w:pPr>
+        <w:ind w:left="708"/>
+        <w:jc w:val="both"/>
+      </w:pPr>
+      <w:r>
+        <w:t xml:space="preserve">Se desarrolló e implementó una plataforma web que integra la información climática del SENAMHI, la logística ferroviaria de PeruRail y el catálogo turístico de Travel Group Perú, y que a partir de esas tres fuentes recomienda circuitos peatonales de ida y vuelta desde una estación de tren, con lo que se cumple el objetivo general planteado en la sección 1.3. El sistema quedó desplegado en contenedores Docker (aplicación Spring Boot 4.1.1 en el puerto 8082 y PostgreSQL 15 en el 5440) y cubre los cuatro módulos del alcance: integración de datos, administración, cliente final e informes.</w:t>
+      </w:r>
+    </w:p>
+    <w:p>
+      <w:pPr>
+        <w:ind w:left="708"/>
+        <w:jc w:val="both"/>
+      </w:pPr>
+      <w:r>
+        <w:t xml:space="preserve">La integración con las fuentes externas se resolvió mediante clientes RestClient y tareas programadas (Spring @Scheduled) que sincronizan a diario estaciones, horarios y tarifas de PeruRail y las previsiones del SENAMHI, validan cada registro antes de persistirlo (tarifas positivas, probabilidad de lluvia entre 0 y 100) y dejan traza en la tabla de auditoría, en cumplimiento de los RF-14 a RF-16 y del RNF-03. Mientras los proveedores no expongan sus servicios reales, el mock del SENAMHI y la carga inicial de PeruRail permitieron ejercitar el mismo camino de código que seguirá el feed definitivo.</w:t>
+      </w:r>
+    </w:p>
+    <w:p>
+      <w:pPr>
+        <w:ind w:left="708"/>
+        <w:jc w:val="both"/>
+      </w:pPr>
+      <w:r>
+        <w:t xml:space="preserve">El buscador con filtros acumulativos y opcionales (preferencia, tiempo disponible, dificultad y estación), el motor de rutas basado en la fórmula de Haversine con umbrales parametrizados en la tabla dificultad y el mapa interactivo (Leaflet con OSRM para el tramo a pie y el trazado real de la vía férrea para el tramo en tren) cumplen los RF-01 a RF-07 y permiten al turista ver en una sola pantalla distancia, tiempo, dificultad, clima y tarifa. Mantener el cálculo en el servidor y evitar dependencias externas para la lógica interna sostiene el tiempo de respuesta exigido por el RNF-01, y la interfaz responsive (RNF-02) hace utilizable la plataforma desde el teléfono en la propia estación.</w:t>
+      </w:r>
+    </w:p>
+    <w:p>
+      <w:pPr>
+        <w:ind w:left="708"/>
+        <w:jc w:val="both"/>
+      </w:pPr>
+      <w:r>
+        <w:t xml:space="preserve">El informe consolidado (HTML y PDF) reúne ruta, clima, servicio de tren elegido y desglose por edad con los tramos tarifarios propios de cada proveedor, mientras que el control de aforo se resuelve con una actualización atómica en la base de datos que acepta o rechaza al grupo completo y sugiere la primera fecha con cupo (RF-08, RF-17 a RF-19, RNF-08). Estas reglas, junto con el historial de informes del turista registrado (RF-10, RF-20), constituyen el valor diferencial de la plataforma frente a consultar cada fuente por separado.</w:t>
+      </w:r>
+    </w:p>
+    <w:p>
+      <w:pPr>
+        <w:ind w:left="708"/>
+        <w:jc w:val="both"/>
+      </w:pPr>
+      <w:r>
+        <w:t xml:space="preserve">Los paneles de Travel Group Perú y PeruRail (zonas con geoselector en el mapa y propuesta automática de la estación más cercana, alta de preferencias sin salir del formulario, horarios con llegada sugerida y validación de la velocidad implícita) demuestran que las tablas paramétricas del RNF-06 permiten ampliar el catálogo sin modificar el código, y que cada operación administrativa queda auditada (RNF-07) y restringida por rol mediante Spring Security (RNF-05).</w:t>
+      </w:r>
+    </w:p>
+    <w:p>
+      <w:pPr>
+        <w:ind w:left="708"/>
+        <w:jc w:val="both"/>
+      </w:pPr>
+      <w:r>
+        <w:t xml:space="preserve">La calidad se sostuvo con una suite de 148 pruebas automatizadas (unitarias con Mockito, de integración sobre H2 y de integridad del esquema sobre PostgreSQL real mediante Testcontainers), documentadas en las matrices de caja blanca (CB-01 a CB-21) y de caja negra (CN-01 a CN-23), estas últimas verificadas en navegador, además de sondeos de robustez con entradas malformadas que llevaron a endurecer validaciones y mensajes. Este trabajo, organizado en los sprints de la metodología Scrum descrita en las secciones 2 y 7, permitió entregar un producto estable y una documentación alineada con el código.</w:t>
+      </w:r>
+    </w:p>
+    <w:p>
+      <w:pPr>
+        <w:pStyle w:val="Ttulo2"/>
+        <w:rPr>
+          <w:rFonts w:ascii="Calibri" w:hAnsi="Calibri" w:cs="Calibri"/>
+          <w:b/>
+          <w:bCs/>
+          <w:color w:val="auto"/>
+          <w:sz w:val="24"/>
+          <w:szCs w:val="24"/>
+        </w:rPr>
+      </w:pPr>
+      <w:r>
+        <w:tab/>
+      </w:r>
+      <w:bookmarkStart w:id="38" w:name="_Toc239283090"/>
+      <w:r>
+        <w:rPr>
+          <w:rFonts w:ascii="Calibri" w:hAnsi="Calibri" w:cs="Calibri"/>
+          <w:b/>
+          <w:bCs/>
+          <w:color w:val="auto"/>
+          <w:sz w:val="24"/>
+          <w:szCs w:val="24"/>
+        </w:rPr>
+        <w:t>9.2. Recomendaciones y trabajo futuro</w:t>
+      </w:r>
+      <w:bookmarkEnd w:id="38"/>
+    </w:p>
+    <w:p>
+      <w:pPr>
+        <w:pStyle w:val="Prrafodelista"/>
+        <w:numPr>
+          <w:ilvl w:val="0"/>
+          <w:numId w:val="28"/>
+        </w:numPr>
+        <w:jc w:val="both"/>
+      </w:pPr>
+      <w:r>
+        <w:t xml:space="preserve">Conectar los clientes de PeruRail y SENAMHI a los servicios reales de ambos proveedores, acordando formatos, credenciales y frecuencias de actualización, ya que hoy la aplicación consume un mock y una carga inicial simulada.</w:t>
+      </w:r>
+    </w:p>
+    <w:p>
+      <w:pPr>
+        <w:pStyle w:val="Prrafodelista"/>
+        <w:numPr>
+          <w:ilvl w:val="0"/>
+          <w:numId w:val="28"/>
+        </w:numPr>
+        <w:jc w:val="both"/>
+      </w:pPr>
+      <w:r>
+        <w:t xml:space="preserve">Vincular la consulta pública de informes a su titular o a un código no correlativo (por ejemplo, un enlace firmado para los invitados), de modo que un informe no pueda consultarse ni reconstruirse conociendo únicamente su numeración.</w:t>
+      </w:r>
+    </w:p>
+    <w:p>
+      <w:pPr>
+        <w:pStyle w:val="Prrafodelista"/>
+        <w:numPr>
+          <w:ilvl w:val="0"/>
+          <w:numId w:val="28"/>
+        </w:numPr>
+        <w:jc w:val="both"/>
+      </w:pPr>
+      <w:r>
+        <w:t xml:space="preserve">Sustituir la estimación en línea recta del tramo a pie por la longitud de la ruta OSRM cuando el servicio esté disponible, y persistir el trazado de la vía férrea en la base de datos en lugar del GeoJSON estático.</w:t>
+      </w:r>
+    </w:p>
+    <w:p>
+      <w:pPr>
+        <w:pStyle w:val="Prrafodelista"/>
+        <w:numPr>
+          <w:ilvl w:val="0"/>
+          <w:numId w:val="28"/>
+        </w:numPr>
+        <w:jc w:val="both"/>
+      </w:pPr>
+      <w:r>
+        <w:t xml:space="preserve">Extender el modelo a itinerarios con más de un tramo o con transporte combinado, hoy fuera del alcance (sección 1.4), y admitir nombres en alfabetos no latinos en el registro de cuentas.</w:t>
+      </w:r>
+    </w:p>
+    <w:p>
+      <w:pPr>
+        <w:pStyle w:val="Prrafodelista"/>
+        <w:numPr>
+          <w:ilvl w:val="0"/>
+          <w:numId w:val="28"/>
+        </w:numPr>
+        <w:jc w:val="both"/>
+      </w:pPr>
+      <w:r>
+        <w:t xml:space="preserve">Incorporar notificaciones al turista ante cambios de clima o de horario en la fecha de visita, y métricas de uso que permitan al MTC medir el impacto de la plataforma en el uso del ferrocarril y en el turismo local.</w:t>
+      </w:r>
+    </w:p>
+    <w:p>
+      <w:pPr>
+        <w:pStyle w:val="Prrafodelista"/>
+        <w:numPr>
+          <w:ilvl w:val="0"/>
+          <w:numId w:val="28"/>
+        </w:numPr>
+        <w:jc w:val="both"/>
+      </w:pPr>
+      <w:r>
+        <w:t xml:space="preserve">Publicar la aplicación con HTTPS y un proveedor de mapas con clave restringida por dominio, y ejecutar la suite de pruebas en integración continua para conservar el nivel de calidad alcanzado.</w:t>
+      </w:r>
+    </w:p>
     <w:p/>
     <w:sectPr>
       <w:pgSz w:w="11906" w:h="16838"/>

</xml_diff>